<commit_message>
Reduce proposal prices: package from R$ 9.500 to R$ 4.200
Co-Authored-By: Claude Opus 5.5 <noreply@anthropic.com>
Claude-Session: https://claude.ai/code/session_01BaE6pxU5SKwXbNzPcRVNVa
</commit_message>
<xml_diff>
--- a/proposta-luxy-beauty/Proposta-Luxy-Beauty-Imports.docx
+++ b/proposta-luxy-beauty/Proposta-Luxy-Beauty-Imports.docx
@@ -460,7 +460,7 @@
                 <w:sz w:val="20"/>
                 <w:szCs w:val="20"/>
               </w:rPr>
-              <w:t xml:space="preserve">R$ 1.500,00</w:t>
+              <w:t xml:space="preserve">R$ 700,00</w:t>
             </w:r>
           </w:p>
         </w:tc>
@@ -578,7 +578,7 @@
                 <w:sz w:val="20"/>
                 <w:szCs w:val="20"/>
               </w:rPr>
-              <w:t xml:space="preserve">R$ 2.800,00</w:t>
+              <w:t xml:space="preserve">R$ 1.200,00</w:t>
             </w:r>
           </w:p>
         </w:tc>
@@ -696,7 +696,7 @@
                 <w:sz w:val="20"/>
                 <w:szCs w:val="20"/>
               </w:rPr>
-              <w:t xml:space="preserve">R$ 1.200,00</w:t>
+              <w:t xml:space="preserve">R$ 500,00</w:t>
             </w:r>
           </w:p>
         </w:tc>
@@ -814,7 +814,7 @@
                 <w:sz w:val="20"/>
                 <w:szCs w:val="20"/>
               </w:rPr>
-              <w:t xml:space="preserve">R$ 2.500,00</w:t>
+              <w:t xml:space="preserve">R$ 1.100,00</w:t>
             </w:r>
           </w:p>
         </w:tc>
@@ -932,7 +932,7 @@
                 <w:sz w:val="20"/>
                 <w:szCs w:val="20"/>
               </w:rPr>
-              <w:t xml:space="preserve">R$ 1.200,00</w:t>
+              <w:t xml:space="preserve">R$ 500,00</w:t>
             </w:r>
           </w:p>
         </w:tc>
@@ -1050,7 +1050,7 @@
                 <w:sz w:val="20"/>
                 <w:szCs w:val="20"/>
               </w:rPr>
-              <w:t xml:space="preserve">R$ 400,00</w:t>
+              <w:t xml:space="preserve">R$ 200,00</w:t>
             </w:r>
           </w:p>
         </w:tc>
@@ -1168,7 +1168,7 @@
                 <w:sz w:val="20"/>
                 <w:szCs w:val="20"/>
               </w:rPr>
-              <w:t xml:space="preserve">R$ 600,00</w:t>
+              <w:t xml:space="preserve">R$ 400,00</w:t>
             </w:r>
           </w:p>
         </w:tc>
@@ -1298,7 +1298,7 @@
                 <w:sz w:val="20"/>
                 <w:szCs w:val="20"/>
               </w:rPr>
-              <w:t xml:space="preserve">R$ 10.200,00</w:t>
+              <w:t xml:space="preserve">R$ 4.600,00</w:t>
             </w:r>
           </w:p>
         </w:tc>
@@ -1364,7 +1364,7 @@
                 <w:sz w:val="20"/>
                 <w:szCs w:val="20"/>
               </w:rPr>
-              <w:t xml:space="preserve">Pacote completo (desconto de ~7%)</w:t>
+              <w:t xml:space="preserve">Pacote completo (desconto de ~9%)</w:t>
             </w:r>
           </w:p>
         </w:tc>
@@ -1428,7 +1428,7 @@
                 <w:sz w:val="20"/>
                 <w:szCs w:val="20"/>
               </w:rPr>
-              <w:t xml:space="preserve">R$ 9.500,00</w:t>
+              <w:t xml:space="preserve">R$ 4.200,00</w:t>
             </w:r>
           </w:p>
         </w:tc>
@@ -1446,7 +1446,7 @@
           <w:b/>
           <w:bCs/>
         </w:rPr>
-        <w:t xml:space="preserve">R$ 9.500,00</w:t>
+        <w:t xml:space="preserve">R$ 4.200,00</w:t>
       </w:r>
       <w:r>
         <w:t xml:space="preserve">.</w:t>
@@ -1465,7 +1465,7 @@
         <w:pStyle w:val="Heading2"/>
       </w:pPr>
       <w:r>
-        <w:t xml:space="preserve">3.1 WooCommerce / site (R$ 1.500)</w:t>
+        <w:t xml:space="preserve">3.1 WooCommerce / site (R$ 700)</w:t>
       </w:r>
     </w:p>
     <w:p>
@@ -1564,7 +1564,7 @@
         <w:pStyle w:val="Heading2"/>
       </w:pPr>
       <w:r>
-        <w:t xml:space="preserve">3.2 Integração WooCommerce + Olist + APPMAX (R$ 2.800)</w:t>
+        <w:t xml:space="preserve">3.2 Integração WooCommerce + Olist + APPMAX (R$ 1.200)</w:t>
       </w:r>
     </w:p>
     <w:p>
@@ -1790,7 +1790,7 @@
         <w:pStyle w:val="Heading2"/>
       </w:pPr>
       <w:r>
-        <w:t xml:space="preserve">3.3 NF-e, etiquetas e envio (R$ 1.200)</w:t>
+        <w:t xml:space="preserve">3.3 NF-e, etiquetas e envio (R$ 500)</w:t>
       </w:r>
     </w:p>
     <w:p>
@@ -1929,7 +1929,7 @@
         <w:pStyle w:val="Heading2"/>
       </w:pPr>
       <w:r>
-        <w:t xml:space="preserve">3.4 WhatsApp + IA, "MEU MOUSE" (R$ 2.500)</w:t>
+        <w:t xml:space="preserve">3.4 WhatsApp + IA, "MEU MOUSE" (R$ 1.100)</w:t>
       </w:r>
     </w:p>
     <w:p>
@@ -2082,7 +2082,7 @@
         <w:pStyle w:val="Heading2"/>
       </w:pPr>
       <w:r>
-        <w:t xml:space="preserve">3.5 Automações adicionais (R$ 1.200)</w:t>
+        <w:t xml:space="preserve">3.5 Automações adicionais (R$ 500)</w:t>
       </w:r>
     </w:p>
     <w:p>
@@ -2170,7 +2170,7 @@
         <w:pStyle w:val="Heading2"/>
       </w:pPr>
       <w:r>
-        <w:t xml:space="preserve">3.6 Testes e treinamento (R$ 400)</w:t>
+        <w:t xml:space="preserve">3.6 Testes e treinamento (R$ 200)</w:t>
       </w:r>
     </w:p>
     <w:p>
@@ -2224,7 +2224,7 @@
         <w:pStyle w:val="Heading2"/>
       </w:pPr>
       <w:r>
-        <w:t xml:space="preserve">3.7 Suporte (R$ 600)</w:t>
+        <w:t xml:space="preserve">3.7 Suporte (R$ 400)</w:t>
       </w:r>
     </w:p>
     <w:p>
@@ -2277,7 +2277,7 @@
           <w:b/>
           <w:bCs/>
         </w:rPr>
-        <w:t xml:space="preserve">R$ 100,00/hora</w:t>
+        <w:t xml:space="preserve">R$ 70,00/hora</w:t>
       </w:r>
       <w:r>
         <w:t xml:space="preserve">.</w:t>
@@ -3150,7 +3150,7 @@
                 <w:sz w:val="20"/>
                 <w:szCs w:val="20"/>
               </w:rPr>
-              <w:t xml:space="preserve">R$ 1.900,00</w:t>
+              <w:t xml:space="preserve">R$ 840,00</w:t>
             </w:r>
           </w:p>
         </w:tc>
@@ -3268,7 +3268,7 @@
                 <w:sz w:val="20"/>
                 <w:szCs w:val="20"/>
               </w:rPr>
-              <w:t xml:space="preserve">R$ 3.800,00</w:t>
+              <w:t xml:space="preserve">R$ 1.680,00</w:t>
             </w:r>
           </w:p>
         </w:tc>
@@ -3386,7 +3386,7 @@
                 <w:sz w:val="20"/>
                 <w:szCs w:val="20"/>
               </w:rPr>
-              <w:t xml:space="preserve">R$ 2.850,00</w:t>
+              <w:t xml:space="preserve">R$ 1.260,00</w:t>
             </w:r>
           </w:p>
         </w:tc>
@@ -3504,7 +3504,7 @@
                 <w:sz w:val="20"/>
                 <w:szCs w:val="20"/>
               </w:rPr>
-              <w:t xml:space="preserve">R$ 950,00</w:t>
+              <w:t xml:space="preserve">R$ 420,00</w:t>
             </w:r>
           </w:p>
         </w:tc>
@@ -3634,7 +3634,7 @@
                 <w:sz w:val="20"/>
                 <w:szCs w:val="20"/>
               </w:rPr>
-              <w:t xml:space="preserve">R$ 9.500,00</w:t>
+              <w:t xml:space="preserve">R$ 4.200,00</w:t>
             </w:r>
           </w:p>
         </w:tc>

</xml_diff>

<commit_message>
Halve proposal prices again: package from R$ 4.200 to R$ 2.100
Co-Authored-By: Claude Opus 5.5 <noreply@anthropic.com>
Claude-Session: https://claude.ai/code/session_01BaE6pxU5SKwXbNzPcRVNVa
</commit_message>
<xml_diff>
--- a/proposta-luxy-beauty/Proposta-Luxy-Beauty-Imports.docx
+++ b/proposta-luxy-beauty/Proposta-Luxy-Beauty-Imports.docx
@@ -460,7 +460,7 @@
                 <w:sz w:val="20"/>
                 <w:szCs w:val="20"/>
               </w:rPr>
-              <w:t xml:space="preserve">R$ 700,00</w:t>
+              <w:t xml:space="preserve">R$ 350,00</w:t>
             </w:r>
           </w:p>
         </w:tc>
@@ -578,7 +578,7 @@
                 <w:sz w:val="20"/>
                 <w:szCs w:val="20"/>
               </w:rPr>
-              <w:t xml:space="preserve">R$ 1.200,00</w:t>
+              <w:t xml:space="preserve">R$ 600,00</w:t>
             </w:r>
           </w:p>
         </w:tc>
@@ -696,7 +696,7 @@
                 <w:sz w:val="20"/>
                 <w:szCs w:val="20"/>
               </w:rPr>
-              <w:t xml:space="preserve">R$ 500,00</w:t>
+              <w:t xml:space="preserve">R$ 250,00</w:t>
             </w:r>
           </w:p>
         </w:tc>
@@ -814,7 +814,7 @@
                 <w:sz w:val="20"/>
                 <w:szCs w:val="20"/>
               </w:rPr>
-              <w:t xml:space="preserve">R$ 1.100,00</w:t>
+              <w:t xml:space="preserve">R$ 550,00</w:t>
             </w:r>
           </w:p>
         </w:tc>
@@ -932,7 +932,7 @@
                 <w:sz w:val="20"/>
                 <w:szCs w:val="20"/>
               </w:rPr>
-              <w:t xml:space="preserve">R$ 500,00</w:t>
+              <w:t xml:space="preserve">R$ 250,00</w:t>
             </w:r>
           </w:p>
         </w:tc>
@@ -1050,7 +1050,7 @@
                 <w:sz w:val="20"/>
                 <w:szCs w:val="20"/>
               </w:rPr>
-              <w:t xml:space="preserve">R$ 200,00</w:t>
+              <w:t xml:space="preserve">R$ 100,00</w:t>
             </w:r>
           </w:p>
         </w:tc>
@@ -1168,7 +1168,7 @@
                 <w:sz w:val="20"/>
                 <w:szCs w:val="20"/>
               </w:rPr>
-              <w:t xml:space="preserve">R$ 400,00</w:t>
+              <w:t xml:space="preserve">R$ 200,00</w:t>
             </w:r>
           </w:p>
         </w:tc>
@@ -1298,7 +1298,7 @@
                 <w:sz w:val="20"/>
                 <w:szCs w:val="20"/>
               </w:rPr>
-              <w:t xml:space="preserve">R$ 4.600,00</w:t>
+              <w:t xml:space="preserve">R$ 2.300,00</w:t>
             </w:r>
           </w:p>
         </w:tc>
@@ -1428,7 +1428,7 @@
                 <w:sz w:val="20"/>
                 <w:szCs w:val="20"/>
               </w:rPr>
-              <w:t xml:space="preserve">R$ 4.200,00</w:t>
+              <w:t xml:space="preserve">R$ 2.100,00</w:t>
             </w:r>
           </w:p>
         </w:tc>
@@ -1446,7 +1446,7 @@
           <w:b/>
           <w:bCs/>
         </w:rPr>
-        <w:t xml:space="preserve">R$ 4.200,00</w:t>
+        <w:t xml:space="preserve">R$ 2.100,00</w:t>
       </w:r>
       <w:r>
         <w:t xml:space="preserve">.</w:t>
@@ -1465,7 +1465,7 @@
         <w:pStyle w:val="Heading2"/>
       </w:pPr>
       <w:r>
-        <w:t xml:space="preserve">3.1 WooCommerce / site (R$ 700)</w:t>
+        <w:t xml:space="preserve">3.1 WooCommerce / site (R$ 350)</w:t>
       </w:r>
     </w:p>
     <w:p>
@@ -1564,7 +1564,7 @@
         <w:pStyle w:val="Heading2"/>
       </w:pPr>
       <w:r>
-        <w:t xml:space="preserve">3.2 Integração WooCommerce + Olist + APPMAX (R$ 1.200)</w:t>
+        <w:t xml:space="preserve">3.2 Integração WooCommerce + Olist + APPMAX (R$ 600)</w:t>
       </w:r>
     </w:p>
     <w:p>
@@ -1790,7 +1790,7 @@
         <w:pStyle w:val="Heading2"/>
       </w:pPr>
       <w:r>
-        <w:t xml:space="preserve">3.3 NF-e, etiquetas e envio (R$ 500)</w:t>
+        <w:t xml:space="preserve">3.3 NF-e, etiquetas e envio (R$ 250)</w:t>
       </w:r>
     </w:p>
     <w:p>
@@ -1929,7 +1929,7 @@
         <w:pStyle w:val="Heading2"/>
       </w:pPr>
       <w:r>
-        <w:t xml:space="preserve">3.4 WhatsApp + IA, "MEU MOUSE" (R$ 1.100)</w:t>
+        <w:t xml:space="preserve">3.4 WhatsApp + IA, "MEU MOUSE" (R$ 550)</w:t>
       </w:r>
     </w:p>
     <w:p>
@@ -2082,7 +2082,7 @@
         <w:pStyle w:val="Heading2"/>
       </w:pPr>
       <w:r>
-        <w:t xml:space="preserve">3.5 Automações adicionais (R$ 500)</w:t>
+        <w:t xml:space="preserve">3.5 Automações adicionais (R$ 250)</w:t>
       </w:r>
     </w:p>
     <w:p>
@@ -2170,7 +2170,7 @@
         <w:pStyle w:val="Heading2"/>
       </w:pPr>
       <w:r>
-        <w:t xml:space="preserve">3.6 Testes e treinamento (R$ 200)</w:t>
+        <w:t xml:space="preserve">3.6 Testes e treinamento (R$ 100)</w:t>
       </w:r>
     </w:p>
     <w:p>
@@ -2224,7 +2224,7 @@
         <w:pStyle w:val="Heading2"/>
       </w:pPr>
       <w:r>
-        <w:t xml:space="preserve">3.7 Suporte (R$ 400)</w:t>
+        <w:t xml:space="preserve">3.7 Suporte (R$ 200)</w:t>
       </w:r>
     </w:p>
     <w:p>
@@ -2277,7 +2277,7 @@
           <w:b/>
           <w:bCs/>
         </w:rPr>
-        <w:t xml:space="preserve">R$ 70,00/hora</w:t>
+        <w:t xml:space="preserve">R$ 50,00/hora</w:t>
       </w:r>
       <w:r>
         <w:t xml:space="preserve">.</w:t>
@@ -3150,7 +3150,7 @@
                 <w:sz w:val="20"/>
                 <w:szCs w:val="20"/>
               </w:rPr>
-              <w:t xml:space="preserve">R$ 840,00</w:t>
+              <w:t xml:space="preserve">R$ 420,00</w:t>
             </w:r>
           </w:p>
         </w:tc>
@@ -3268,7 +3268,7 @@
                 <w:sz w:val="20"/>
                 <w:szCs w:val="20"/>
               </w:rPr>
-              <w:t xml:space="preserve">R$ 1.680,00</w:t>
+              <w:t xml:space="preserve">R$ 840,00</w:t>
             </w:r>
           </w:p>
         </w:tc>
@@ -3386,7 +3386,7 @@
                 <w:sz w:val="20"/>
                 <w:szCs w:val="20"/>
               </w:rPr>
-              <w:t xml:space="preserve">R$ 1.260,00</w:t>
+              <w:t xml:space="preserve">R$ 630,00</w:t>
             </w:r>
           </w:p>
         </w:tc>
@@ -3504,7 +3504,7 @@
                 <w:sz w:val="20"/>
                 <w:szCs w:val="20"/>
               </w:rPr>
-              <w:t xml:space="preserve">R$ 420,00</w:t>
+              <w:t xml:space="preserve">R$ 210,00</w:t>
             </w:r>
           </w:p>
         </w:tc>
@@ -3634,7 +3634,7 @@
                 <w:sz w:val="20"/>
                 <w:szCs w:val="20"/>
               </w:rPr>
-              <w:t xml:space="preserve">R$ 4.200,00</w:t>
+              <w:t xml:space="preserve">R$ 2.100,00</w:t>
             </w:r>
           </w:p>
         </w:tc>

</xml_diff>